<commit_message>
QC pass: T-15 example and toolkit zip updated for the Calvenox case
</commit_message>
<xml_diff>
--- a/toolkit/T-15_Totality_of_Evidence_and_Device_Causality.docx
+++ b/toolkit/T-15_Totality_of_Evidence_and_Device_Causality.docx
@@ -2324,7 +2324,7 @@
           <w:color w:val="595959"/>
           <w:sz w:val="18"/>
         </w:rPr>
-        <w:t>All names, numbers and events below are fictional composites from the book's case dossiers. They show the expected level of detail, not a regulatory standard. Veltrix PEEK cage pre-loaded with OIP-4 (combination product), data cut Year 3, month 6.</w:t>
+        <w:t>All names, numbers and events below are fictional composites from the book's case dossiers. They show the expected level of detail, not a regulatory standard. Calvenox calcium sulfate bone void filler pre-loaded with AGX-3 (combination product), data cut Year 3, month 6.</w:t>
       </w:r>
     </w:p>
     <w:tbl>
@@ -2528,7 +2528,7 @@
                 <w:b w:val="0"/>
                 <w:sz w:val="18"/>
               </w:rPr>
-              <w:t>Onset 2–14 days; 12 off-label; 4 ectopic bone</w:t>
+              <w:t>Onset 2–14 days; 12 above 20 mL; 4 toxic serum levels</w:t>
             </w:r>
           </w:p>
         </w:tc>
@@ -2546,7 +2546,7 @@
                 <w:b w:val="0"/>
                 <w:sz w:val="18"/>
               </w:rPr>
-              <w:t>Timing and imaging informative; no denominator by approach</w:t>
+              <w:t>Timing and levels informative; no denominator by volume</w:t>
             </w:r>
           </w:p>
         </w:tc>
@@ -2628,7 +2628,7 @@
                 <w:b w:val="0"/>
                 <w:sz w:val="18"/>
               </w:rPr>
-              <w:t>3.3% (1.6–6.7) in anterior use</w:t>
+              <w:t>3.3% (1.6–6.7) in on-label use</w:t>
             </w:r>
           </w:p>
         </w:tc>
@@ -2728,7 +2728,7 @@
                 <w:b w:val="0"/>
                 <w:sz w:val="18"/>
               </w:rPr>
-              <w:t>About 1% without protein</w:t>
+              <w:t>About 1% without a local antibiotic carrier</w:t>
             </w:r>
           </w:p>
         </w:tc>
@@ -2746,7 +2746,7 @@
                 <w:b w:val="0"/>
                 <w:sz w:val="18"/>
               </w:rPr>
-              <w:t>Different populations and definitions</w:t>
+              <w:t>Different populations and AKI definitions</w:t>
             </w:r>
           </w:p>
         </w:tc>
@@ -2810,7 +2810,7 @@
                 <w:b/>
                 <w:sz w:val="18"/>
               </w:rPr>
-              <w:t>Spine registry</w:t>
+              <w:t>Bone infection registry</w:t>
             </w:r>
           </w:p>
         </w:tc>
@@ -2846,7 +2846,7 @@
                 <w:b w:val="0"/>
                 <w:sz w:val="18"/>
               </w:rPr>
-              <w:t>Outcome is reoperation; misses non-surgical cases</w:t>
+              <w:t>Outcome is reinfection or reoperation; misses medically managed AKI</w:t>
             </w:r>
           </w:p>
         </w:tc>
@@ -2928,7 +2928,7 @@
                 <w:b w:val="0"/>
                 <w:sz w:val="18"/>
               </w:rPr>
-              <w:t>No cage failure</w:t>
+              <w:t>No carrier failure</w:t>
             </w:r>
           </w:p>
         </w:tc>
@@ -2946,7 +2946,7 @@
                 <w:b w:val="0"/>
                 <w:sz w:val="18"/>
               </w:rPr>
-              <w:t>Excludes a mechanical cause</w:t>
+              <w:t>Excludes a device defect</w:t>
             </w:r>
           </w:p>
         </w:tc>
@@ -3028,7 +3028,7 @@
                 <w:b w:val="0"/>
                 <w:sz w:val="18"/>
               </w:rPr>
-              <w:t>Protein escape, root exposure</w:t>
+              <w:t>Systemic absorption proportional to volume</w:t>
             </w:r>
           </w:p>
         </w:tc>
@@ -3046,7 +3046,7 @@
                 <w:b w:val="0"/>
                 <w:sz w:val="18"/>
               </w:rPr>
-              <w:t>Fits timing and imaging</w:t>
+              <w:t>Fits timing and serum levels</w:t>
             </w:r>
           </w:p>
         </w:tc>
@@ -3098,7 +3098,7 @@
           <w:color w:val="595959"/>
           <w:sz w:val="17"/>
         </w:rPr>
-        <w:t>Table 17.1 — Veltrix evidence table, data cut Year 3, month 6 (Part A, illustrative).</w:t>
+        <w:t>Table 17.1 — Calvenox evidence table, data cut Year 3, month 6 (Part A, illustrative).</w:t>
       </w:r>
     </w:p>
     <w:tbl>
@@ -3180,7 +3180,7 @@
                 <w:color w:val="FFFFFF"/>
                 <w:sz w:val="18"/>
               </w:rPr>
-              <w:t>Veltrix evidence</w:t>
+              <w:t>Calvenox evidence</w:t>
             </w:r>
           </w:p>
         </w:tc>
@@ -3394,7 +3394,7 @@
                 <w:b w:val="0"/>
                 <w:sz w:val="18"/>
               </w:rPr>
-              <w:t>Standard definition in PMCF</w:t>
+              <w:t>Standard AKI definition in PMCF</w:t>
             </w:r>
           </w:p>
         </w:tc>
@@ -3440,7 +3440,7 @@
                 <w:b w:val="0"/>
                 <w:sz w:val="18"/>
               </w:rPr>
-              <w:t>Off-label approaches, which expose the root, dominate reports</w:t>
+              <w:t>Fills above 20 mL or across several sites dominate reports</w:t>
             </w:r>
           </w:p>
         </w:tc>
@@ -3476,7 +3476,7 @@
                 <w:b w:val="0"/>
                 <w:sz w:val="18"/>
               </w:rPr>
-              <w:t>Approach-specific denominator</w:t>
+              <w:t>Volume-specific denominator</w:t>
             </w:r>
           </w:p>
         </w:tc>
@@ -3522,7 +3522,7 @@
                 <w:b w:val="0"/>
                 <w:sz w:val="18"/>
               </w:rPr>
-              <w:t>Not applicable to a fused cage</w:t>
+              <w:t>Carrier resorbs and cannot be removed; renal recovery after the drug clears is consistent</w:t>
             </w:r>
           </w:p>
         </w:tc>
@@ -3540,7 +3540,7 @@
                 <w:b w:val="0"/>
                 <w:sz w:val="18"/>
               </w:rPr>
-              <w:t>Neutral</w:t>
+              <w:t>Weakly supports</w:t>
             </w:r>
           </w:p>
         </w:tc>
@@ -3558,7 +3558,7 @@
                 <w:b w:val="0"/>
                 <w:sz w:val="18"/>
               </w:rPr>
-              <w:t>None feasible</w:t>
+              <w:t>Renal follow-up in PMCF</w:t>
             </w:r>
           </w:p>
         </w:tc>
@@ -3604,7 +3604,7 @@
                 <w:b w:val="0"/>
                 <w:sz w:val="18"/>
               </w:rPr>
-              <w:t>No cage failure; ectopic bone in 4 of 19; inflammatory mechanism</w:t>
+              <w:t>No carrier failure; toxic serum level in 4 of 19; aminoglycoside nephrotoxicity</w:t>
             </w:r>
           </w:p>
         </w:tc>
@@ -3640,7 +3640,7 @@
                 <w:b w:val="0"/>
                 <w:sz w:val="18"/>
               </w:rPr>
-              <w:t>Imaging review of PMCF cases</w:t>
+              <w:t>Serum levels and creatinine in PMCF</w:t>
             </w:r>
           </w:p>
         </w:tc>
@@ -3656,7 +3656,7 @@
           <w:color w:val="595959"/>
           <w:sz w:val="17"/>
         </w:rPr>
-        <w:t>Table 17.2 — T-15 Part B, device-causality argument for Veltrix (illustrative).</w:t>
+        <w:t>Table 17.2 — T-15 Part B, device-causality argument for Calvenox (illustrative).</w:t>
       </w:r>
     </w:p>
     <w:tbl>
@@ -3736,7 +3736,7 @@
                 <w:color w:val="FFFFFF"/>
                 <w:sz w:val="18"/>
               </w:rPr>
-              <w:t>Veltrix entry</w:t>
+              <w:t>Calvenox entry</w:t>
             </w:r>
           </w:p>
         </w:tc>
@@ -3782,7 +3782,7 @@
                 <w:b w:val="0"/>
                 <w:sz w:val="18"/>
               </w:rPr>
-              <w:t>Signal confirmed. Probable causal association between OIP-4 delivered with Veltrix and postoperative radiculitis; strongest with off-label posterior or transforaminal use; some excess also with anterior use.</w:t>
+              <w:t>Signal confirmed. Probable causal association between AGX-3 delivered with Calvenox and postoperative acute kidney injury (AKI); strongest with off-label high-volume or multi-site use; some excess also with on-label use.</w:t>
             </w:r>
           </w:p>
         </w:tc>
@@ -3828,7 +3828,7 @@
                 <w:b w:val="0"/>
                 <w:sz w:val="18"/>
               </w:rPr>
-              <w:t>The size of the on-label excess and the true rate by approach.</w:t>
+              <w:t>The size of the on-label excess and the true rate by volume.</w:t>
             </w:r>
           </w:p>
         </w:tc>
@@ -3874,7 +3874,7 @@
                 <w:b w:val="0"/>
                 <w:sz w:val="18"/>
               </w:rPr>
-              <w:t>New hazardous situation (protein reaching an exposed nerve root); re-estimated probability for on-label use.</w:t>
+              <w:t>New hazardous situation (systemic AGX-3 exposure from a fill above the labeled volume); re-estimated probability for on-label use.</w:t>
             </w:r>
           </w:p>
         </w:tc>
@@ -3920,7 +3920,7 @@
                 <w:b w:val="0"/>
                 <w:sz w:val="18"/>
               </w:rPr>
-              <w:t>IFU warning and contraindication for posterior and transforaminal approaches; surgeon communication; PMCF amendment adding a standard radiculitis definition; report, through the notified body, to the medicines authority consulted on the ancillary substance (MDR Article 1(8), Annex IX section 5.2).</w:t>
+              <w:t>IFU warning and contraindication for fill volumes above 20 mL and for multi-site use; surgeon communication; PMCF amendment adding a standard AKI definition (KDIGO type) and renal function monitoring; report, through the notified body, to the medicines authority consulted on the ancillary substance (MDR Article 1(8), Annex IX section 5.2).</w:t>
             </w:r>
           </w:p>
         </w:tc>

</xml_diff>